<commit_message>
Add .env/config.py setup instructions to deployment guide and README
</commit_message>
<xml_diff>
--- a/documents/Auto_FNOL_Deployment_Guide.docx
+++ b/documents/Auto_FNOL_Deployment_Guide.docx
@@ -105,7 +105,7 @@
       </w:r>
     </w:p>
     <w:p>
-      <w:bookmarkStart w:id="2" w:name="GenerateData"/>
+      <w:bookmarkStart w:id="2" w:name="Configuration"/>
       <w:pPr>
         <w:pStyle w:val="Heading1"/>
       </w:pPr>
@@ -113,9 +113,99 @@
         <w:rPr>
           <w:color w:val="1F3864"/>
         </w:rPr>
-        <w:t>1. Generate &amp; Load Sample Data (datagen/)</w:t>
+        <w:t>1. Configure Your Tenant (.env)</w:t>
       </w:r>
       <w:bookmarkEnd w:id="2"/>
+    </w:p>
+    <w:p>
+      <w:r>
+        <w:rPr>
+          <w:b w:val="0"/>
+          <w:i w:val="0"/>
+          <w:sz w:val="22"/>
+        </w:rPr>
+        <w:t>No tenant-specific values (workspace/lakehouse/agent IDs, endpoints, resource names) are hardcoded in this repo. All scripts read configuration from environment variables via the config.py module at the repo root.</w:t>
+      </w:r>
+    </w:p>
+    <w:p>
+      <w:pPr>
+        <w:pStyle w:val="ListNumber"/>
+      </w:pPr>
+      <w:r>
+        <w:t>Copy .env.example (repo root) to a new file named .env in the repo root.</w:t>
+      </w:r>
+    </w:p>
+    <w:p>
+      <w:pPr>
+        <w:pStyle w:val="ListNumber"/>
+      </w:pPr>
+      <w:r>
+        <w:t>Install python-dotenv (pip install python-dotenv) so config.py can auto-load .env, or export the variables directly in your shell/CI environment instead.</w:t>
+      </w:r>
+    </w:p>
+    <w:p>
+      <w:pPr>
+        <w:pStyle w:val="ListNumber"/>
+      </w:pPr>
+      <w:r>
+        <w:t>Fill in the required, tenant-specific values — these have no safe default and config.py will raise a clear error if left unset: FABRIC_WORKSPACE_ID, FABRIC_LAKEHOUSE_ID (create the workspace/lakehouse first, e.g. WS_AutoFNOL / LH_AutoFNOL, then copy their GUIDs from the Fabric portal URL), FOUNDRY_PROJECT_ENDPOINT (from your Azure AI Foundry project's Overview page), AZURE_SEARCH_ENDPOINT (from your Azure AI Search service's Overview page), and AZURE_OPENAI_ENDPOINT (from your Azure OpenAI/Foundry resource).</w:t>
+      </w:r>
+    </w:p>
+    <w:p>
+      <w:pPr>
+        <w:pStyle w:val="ListNumber"/>
+      </w:pPr>
+      <w:r>
+        <w:t>Leave the remaining variables as-is unless you want different names: they already default to safe values (e.g. FABRIC_LAKEHOUSE_NAME=LH_AutoFNOL, FABRIC_ONTOLOGY_NAME=AutoFNOL_Ontology, FABRIC_DATA_AGENT_NAME=DA_AutoFNOL_Ontology, FOUNDRY_AGENT_NAME=Auto-FNOL-Knowledge-Agent, AZURE_SEARCH_INDEX_NAME=auto-fnol-kb-index, FOUNDRY_MODEL_DEPLOYMENT=gpt-4o, AZURE_OPENAI_EMBEDDING_DEPLOYMENT=text-embedding-ada-002).</w:t>
+      </w:r>
+    </w:p>
+    <w:p>
+      <w:pPr>
+        <w:pStyle w:val="ListNumber"/>
+      </w:pPr>
+      <w:r>
+        <w:t>FABRIC_ONTOLOGY_ID, FABRIC_GRAPH_MODEL_ID, and FABRIC_DATA_AGENT_ID start blank — they are produced by the Section 2 scripts (create_ontology.py, configure_data_agent*.py) and only need to be set in .env afterwards if you re-run configure_data_agent.py/configure_data_agent_ontology.py separately later (e.g. to reconfigure without recreating).</w:t>
+      </w:r>
+    </w:p>
+    <w:p>
+      <w:pPr>
+        <w:pStyle w:val="ListNumber"/>
+      </w:pPr>
+      <w:r>
+        <w:t>Optionally set AZURE_SEARCH_ADMIN_KEY if you prefer key-based auth to Azure AI Search; if left blank, foundry/build_search_index.py falls back to Azure AD bearer-token auth automatically.</w:t>
+      </w:r>
+    </w:p>
+    <w:p>
+      <w:pPr>
+        <w:pStyle w:val="ListNumber"/>
+      </w:pPr>
+      <w:r>
+        <w:t>Run any script from the repo root or a subfolder — each script inserts the repo root onto sys.path and imports config, so .env only needs to exist once at the repo root.</w:t>
+      </w:r>
+    </w:p>
+    <w:p>
+      <w:r>
+        <w:rPr>
+          <w:b w:val="0"/>
+          <w:i/>
+          <w:color w:val="595959"/>
+          <w:sz w:val="22"/>
+        </w:rPr>
+        <w:t>For the Copilot Studio solution in copilotstudio/, also replace the &lt;YOUR_FABRIC_DATA_AGENT_ID&gt; and &lt;YOUR_FABRIC_WORKSPACE_ID&gt; placeholders in actions/InvokeAutoFNOLOntologyAgent.mcs.yml with your own Fabric Data Agent ID and Workspace ID before running pac copilot push (Section 4).</w:t>
+      </w:r>
+    </w:p>
+    <w:p>
+      <w:bookmarkStart w:id="3" w:name="GenerateData"/>
+      <w:pPr>
+        <w:pStyle w:val="Heading1"/>
+      </w:pPr>
+      <w:r>
+        <w:rPr>
+          <w:color w:val="1F3864"/>
+        </w:rPr>
+        <w:t>2. Generate &amp; Load Sample Data (datagen/)</w:t>
+      </w:r>
+      <w:bookmarkEnd w:id="3"/>
     </w:p>
     <w:p>
       <w:r>
@@ -160,7 +250,7 @@
       </w:r>
     </w:p>
     <w:p>
-      <w:bookmarkStart w:id="3" w:name="FabricIQ"/>
+      <w:bookmarkStart w:id="4" w:name="FabricIQ"/>
       <w:pPr>
         <w:pStyle w:val="Heading1"/>
       </w:pPr>
@@ -168,9 +258,9 @@
         <w:rPr>
           <w:color w:val="1F3864"/>
         </w:rPr>
-        <w:t>2. Build the Fabric IQ Ontology &amp; Data Agent (fabric/)</w:t>
+        <w:t>3. Build the Fabric IQ Ontology &amp; Data Agent (fabric/)</w:t>
       </w:r>
-      <w:bookmarkEnd w:id="3"/>
+      <w:bookmarkEnd w:id="4"/>
     </w:p>
     <w:p>
       <w:r>
@@ -226,7 +316,7 @@
       </w:r>
     </w:p>
     <w:p>
-      <w:bookmarkStart w:id="4" w:name="FoundryIQ"/>
+      <w:bookmarkStart w:id="5" w:name="FoundryIQ"/>
       <w:pPr>
         <w:pStyle w:val="Heading1"/>
       </w:pPr>
@@ -234,9 +324,9 @@
         <w:rPr>
           <w:color w:val="1F3864"/>
         </w:rPr>
-        <w:t>3. Build the Foundry IQ Knowledge Agent (foundry/)</w:t>
+        <w:t>4. Build the Foundry IQ Knowledge Agent (foundry/)</w:t>
       </w:r>
-      <w:bookmarkEnd w:id="4"/>
+      <w:bookmarkEnd w:id="5"/>
     </w:p>
     <w:p>
       <w:r>
@@ -297,7 +387,7 @@
       </w:r>
     </w:p>
     <w:p>
-      <w:bookmarkStart w:id="5" w:name="CopilotStudio"/>
+      <w:bookmarkStart w:id="6" w:name="CopilotStudio"/>
       <w:pPr>
         <w:pStyle w:val="Heading1"/>
       </w:pPr>
@@ -305,9 +395,9 @@
         <w:rPr>
           <w:color w:val="1F3864"/>
         </w:rPr>
-        <w:t>4. Deploy the Copilot Studio Orchestrator Agent (copilotstudio/)</w:t>
+        <w:t>5. Deploy the Copilot Studio Orchestrator Agent (copilotstudio/)</w:t>
       </w:r>
-      <w:bookmarkEnd w:id="5"/>
+      <w:bookmarkEnd w:id="6"/>
     </w:p>
     <w:p>
       <w:r>
@@ -376,7 +466,7 @@
       </w:r>
     </w:p>
     <w:p>
-      <w:bookmarkStart w:id="6" w:name="Validate"/>
+      <w:bookmarkStart w:id="7" w:name="Validate"/>
       <w:pPr>
         <w:pStyle w:val="Heading1"/>
       </w:pPr>
@@ -384,9 +474,9 @@
         <w:rPr>
           <w:color w:val="1F3864"/>
         </w:rPr>
-        <w:t>5. Validate End-to-End</w:t>
+        <w:t>6. Validate End-to-End</w:t>
       </w:r>
-      <w:bookmarkEnd w:id="6"/>
+      <w:bookmarkEnd w:id="7"/>
     </w:p>
     <w:p>
       <w:pPr>
@@ -437,7 +527,7 @@
       </w:r>
     </w:p>
     <w:p>
-      <w:bookmarkStart w:id="7" w:name="Troubleshooting"/>
+      <w:bookmarkStart w:id="8" w:name="Troubleshooting"/>
       <w:pPr>
         <w:pStyle w:val="Heading1"/>
       </w:pPr>
@@ -445,9 +535,9 @@
         <w:rPr>
           <w:color w:val="1F3864"/>
         </w:rPr>
-        <w:t>6. Troubleshooting Quick Reference</w:t>
+        <w:t>7. Troubleshooting Quick Reference</w:t>
       </w:r>
-      <w:bookmarkEnd w:id="7"/>
+      <w:bookmarkEnd w:id="8"/>
     </w:p>
     <w:tbl>
       <w:tblPr>
@@ -600,6 +690,38 @@
           <w:p>
             <w:r>
               <w:t>Reconnect the connection reference, re-run pac copilot publish, and confirm the Fabric capacity is Active; isolate with fabric/test_mcp_dataagent.py</w:t>
+            </w:r>
+          </w:p>
+        </w:tc>
+      </w:tr>
+      <w:tr>
+        <w:tc>
+          <w:tcPr>
+            <w:tcW w:type="dxa" w:w="2880"/>
+          </w:tcPr>
+          <w:p>
+            <w:r>
+              <w:t>RuntimeError: &lt;VAR&gt; environment variable is not set (from config.py)</w:t>
+            </w:r>
+          </w:p>
+        </w:tc>
+        <w:tc>
+          <w:tcPr>
+            <w:tcW w:type="dxa" w:w="2880"/>
+          </w:tcPr>
+          <w:p>
+            <w:r>
+              <w:t>Required .env value missing (e.g. FABRIC_WORKSPACE_ID, FOUNDRY_PROJECT_ENDPOINT)</w:t>
+            </w:r>
+          </w:p>
+        </w:tc>
+        <w:tc>
+          <w:tcPr>
+            <w:tcW w:type="dxa" w:w="2880"/>
+          </w:tcPr>
+          <w:p>
+            <w:r>
+              <w:t>Copy .env.example to .env at the repo root and fill in the required tenant-specific values listed in Section 1</w:t>
             </w:r>
           </w:p>
         </w:tc>

</xml_diff>

<commit_message>
Clarify where deployment scripts run (local terminal, repo root, venv, az login)
</commit_message>
<xml_diff>
--- a/documents/Auto_FNOL_Deployment_Guide.docx
+++ b/documents/Auto_FNOL_Deployment_Guide.docx
@@ -102,6 +102,56 @@
       </w:pPr>
       <w:r>
         <w:t>Azure CLI (az) and Power Platform CLI (pac) installed and authenticated (az login; pac auth create).</w:t>
+      </w:r>
+    </w:p>
+    <w:p>
+      <w:r>
+        <w:rPr>
+          <w:b/>
+          <w:i w:val="0"/>
+          <w:sz w:val="22"/>
+        </w:rPr>
+        <w:t>Where these steps are run:</w:t>
+      </w:r>
+    </w:p>
+    <w:p>
+      <w:pPr>
+        <w:pStyle w:val="ListBullet"/>
+      </w:pPr>
+      <w:r>
+        <w:t>All commands in this guide (Sections 1–3) are run from a terminal on your own machine (or a Cloud Shell / VM you control) — nothing here deploys to Azure App Service, Functions, or a container. The Python scripts only call Azure/Fabric/Foundry REST APIs and SDKs from wherever you run them; there is no server component to host.</w:t>
+      </w:r>
+    </w:p>
+    <w:p>
+      <w:pPr>
+        <w:pStyle w:val="ListBullet"/>
+      </w:pPr>
+      <w:r>
+        <w:t>Clone this repo locally, then open a terminal and cd into the repo root (the folder containing config.py, fabric/, foundry/, datagen/, copilotstudio/) — every command below is written relative to that repo-root working directory, e.g. run python fabric/create_ontology.py, not cd fabric first and run python create_ontology.py (both work, since each script inserts the repo root onto sys.path, but the guide assumes you stay at the repo root throughout).</w:t>
+      </w:r>
+    </w:p>
+    <w:p>
+      <w:pPr>
+        <w:pStyle w:val="ListBullet"/>
+      </w:pPr>
+      <w:r>
+        <w:t>Create and activate a Python virtual environment at the repo root (python -m venv .venv, then activate it) and install dependencies (pip install azure-identity azure-ai-projects openai python-docx pandas mcp python-dotenv requests) before running any script.</w:t>
+      </w:r>
+    </w:p>
+    <w:p>
+      <w:pPr>
+        <w:pStyle w:val="ListBullet"/>
+      </w:pPr>
+      <w:r>
+        <w:t>Sign in once per terminal session with az login (used by AzureCliCredential inside the scripts for Fabric/Foundry/Search auth) before running any fabric/*.py or foundry/*.py script.</w:t>
+      </w:r>
+    </w:p>
+    <w:p>
+      <w:pPr>
+        <w:pStyle w:val="ListBullet"/>
+      </w:pPr>
+      <w:r>
+        <w:t>The Copilot Studio steps (Section 5) instead use the Power Platform CLI (pac), run from the copilotstudio/AutoFNOLAgent/ subfolder as noted in that section — pac, not python.</w:t>
       </w:r>
     </w:p>
     <w:p>

</xml_diff>